<commit_message>
Refresh Rmd examples and rendered docs
</commit_message>
<xml_diff>
--- a/examples/anomalies/doc/19-regression-ml-hanr_ml_lstm.docx
+++ b/examples/anomalies/doc/19-regression-ml-hanr_ml_lstm.docx
@@ -2,7 +2,7 @@
 <file path=word/document.xml><?xml version="1.0" encoding="utf-8"?>
 <w:document xmlns:w="http://schemas.openxmlformats.org/wordprocessingml/2006/main" xmlns:m="http://schemas.openxmlformats.org/officeDocument/2006/math" xmlns:r="http://schemas.openxmlformats.org/officeDocument/2006/relationships" xmlns:o="urn:schemas-microsoft-com:office:office" xmlns:v="urn:schemas-microsoft-com:vml" xmlns:w10="urn:schemas-microsoft-com:office:word" xmlns:a="http://schemas.openxmlformats.org/drawingml/2006/main" xmlns:pic="http://schemas.openxmlformats.org/drawingml/2006/picture" xmlns:wp="http://schemas.openxmlformats.org/drawingml/2006/wordprocessingDrawing">
   <w:body>
-    <w:bookmarkStart w:id="20" w:name="objective"/>
+    <w:bookmarkStart w:id="9" w:name="objective"/>
     <w:p>
       <w:pPr>
         <w:pStyle w:val="Heading2"/>
@@ -28,8 +28,8 @@
         <w:t xml:space="preserve">). The model predicts the next value capturing temporal dependencies; anomalies are flagged when residuals exceed a learned threshold. Steps: load packages/data, visualize, define and fit the model, detect, evaluate, and plot results and residuals.</w:t>
       </w:r>
     </w:p>
-    <w:bookmarkEnd w:id="20"/>
-    <w:bookmarkStart w:id="21" w:name="method-at-a-glance"/>
+    <w:bookmarkEnd w:id="9"/>
+    <w:bookmarkStart w:id="10" w:name="method-at-a-glance"/>
     <w:p>
       <w:pPr>
         <w:pStyle w:val="Heading2"/>
@@ -58,8 +58,8 @@
         <w:t xml:space="preserve">.</w:t>
       </w:r>
     </w:p>
-    <w:bookmarkEnd w:id="21"/>
-    <w:bookmarkStart w:id="37" w:name="what-you-will-do"/>
+    <w:bookmarkEnd w:id="10"/>
+    <w:bookmarkStart w:id="17" w:name="what-you-will-do"/>
     <w:p>
       <w:pPr>
         <w:pStyle w:val="Heading2"/>
@@ -104,7 +104,7 @@
         <w:t xml:space="preserve">inspect the evaluation outputs and the diagnostic plots produced by Harbinger</w:t>
       </w:r>
     </w:p>
-    <w:bookmarkStart w:id="22" w:name="prepare-the-example"/>
+    <w:bookmarkStart w:id="11" w:name="prepare-the-example"/>
     <w:p>
       <w:pPr>
         <w:pStyle w:val="Heading3"/>
@@ -223,6 +223,156 @@
         </w:rPr>
         <w:t xml:space="preserve">(daltoolboxdp)</w:t>
       </w:r>
+      <w:r>
+        <w:br/>
+      </w:r>
+      <w:r>
+        <w:rPr>
+          <w:rStyle w:val="NormalTok"/>
+        </w:rPr>
+        <w:t xml:space="preserve">python_available </w:t>
+      </w:r>
+      <w:r>
+        <w:rPr>
+          <w:rStyle w:val="OtherTok"/>
+        </w:rPr>
+        <w:t xml:space="preserve">&lt;-</w:t>
+      </w:r>
+      <w:r>
+        <w:rPr>
+          <w:rStyle w:val="NormalTok"/>
+        </w:rPr>
+        <w:t xml:space="preserve"> </w:t>
+      </w:r>
+      <w:r>
+        <w:rPr>
+          <w:rStyle w:val="FunctionTok"/>
+        </w:rPr>
+        <w:t xml:space="preserve">requireNamespace</w:t>
+      </w:r>
+      <w:r>
+        <w:rPr>
+          <w:rStyle w:val="NormalTok"/>
+        </w:rPr>
+        <w:t xml:space="preserve">(</w:t>
+      </w:r>
+      <w:r>
+        <w:rPr>
+          <w:rStyle w:val="StringTok"/>
+        </w:rPr>
+        <w:t xml:space="preserve">"reticulate"</w:t>
+      </w:r>
+      <w:r>
+        <w:rPr>
+          <w:rStyle w:val="NormalTok"/>
+        </w:rPr>
+        <w:t xml:space="preserve">, </w:t>
+      </w:r>
+      <w:r>
+        <w:rPr>
+          <w:rStyle w:val="AttributeTok"/>
+        </w:rPr>
+        <w:t xml:space="preserve">quietly =</w:t>
+      </w:r>
+      <w:r>
+        <w:rPr>
+          <w:rStyle w:val="NormalTok"/>
+        </w:rPr>
+        <w:t xml:space="preserve"> </w:t>
+      </w:r>
+      <w:r>
+        <w:rPr>
+          <w:rStyle w:val="ConstantTok"/>
+        </w:rPr>
+        <w:t xml:space="preserve">TRUE</w:t>
+      </w:r>
+      <w:r>
+        <w:rPr>
+          <w:rStyle w:val="NormalTok"/>
+        </w:rPr>
+        <w:t xml:space="preserve">) </w:t>
+      </w:r>
+      <w:r>
+        <w:rPr>
+          <w:rStyle w:val="SpecialCharTok"/>
+        </w:rPr>
+        <w:t xml:space="preserve">&amp;&amp;</w:t>
+      </w:r>
+      <w:r>
+        <w:rPr>
+          <w:rStyle w:val="NormalTok"/>
+        </w:rPr>
+        <w:t xml:space="preserve"> reticulate</w:t>
+      </w:r>
+      <w:r>
+        <w:rPr>
+          <w:rStyle w:val="SpecialCharTok"/>
+        </w:rPr>
+        <w:t xml:space="preserve">::</w:t>
+      </w:r>
+      <w:r>
+        <w:rPr>
+          <w:rStyle w:val="FunctionTok"/>
+        </w:rPr>
+        <w:t xml:space="preserve">py_available</w:t>
+      </w:r>
+      <w:r>
+        <w:rPr>
+          <w:rStyle w:val="NormalTok"/>
+        </w:rPr>
+        <w:t xml:space="preserve">()</w:t>
+      </w:r>
+      <w:r>
+        <w:br/>
+      </w:r>
+      <w:r>
+        <w:rPr>
+          <w:rStyle w:val="NormalTok"/>
+        </w:rPr>
+        <w:t xml:space="preserve">knitr</w:t>
+      </w:r>
+      <w:r>
+        <w:rPr>
+          <w:rStyle w:val="SpecialCharTok"/>
+        </w:rPr>
+        <w:t xml:space="preserve">::</w:t>
+      </w:r>
+      <w:r>
+        <w:rPr>
+          <w:rStyle w:val="NormalTok"/>
+        </w:rPr>
+        <w:t xml:space="preserve">opts_chunk</w:t>
+      </w:r>
+      <w:r>
+        <w:rPr>
+          <w:rStyle w:val="SpecialCharTok"/>
+        </w:rPr>
+        <w:t xml:space="preserve">$</w:t>
+      </w:r>
+      <w:r>
+        <w:rPr>
+          <w:rStyle w:val="FunctionTok"/>
+        </w:rPr>
+        <w:t xml:space="preserve">set</w:t>
+      </w:r>
+      <w:r>
+        <w:rPr>
+          <w:rStyle w:val="NormalTok"/>
+        </w:rPr>
+        <w:t xml:space="preserve">(</w:t>
+      </w:r>
+      <w:r>
+        <w:rPr>
+          <w:rStyle w:val="AttributeTok"/>
+        </w:rPr>
+        <w:t xml:space="preserve">eval =</w:t>
+      </w:r>
+      <w:r>
+        <w:rPr>
+          <w:rStyle w:val="NormalTok"/>
+        </w:rPr>
+        <w:t xml:space="preserve"> python_available)</w:t>
+      </w:r>
     </w:p>
     <w:p>
       <w:pPr>
@@ -309,101 +459,665 @@
         <w:t xml:space="preserve">(dataset)</w:t>
       </w:r>
     </w:p>
+    <w:bookmarkEnd w:id="11"/>
+    <w:bookmarkStart w:id="12" w:name="interpret-the-result-visually"/>
+    <w:p>
+      <w:pPr>
+        <w:pStyle w:val="Heading3"/>
+      </w:pPr>
+      <w:r>
+        <w:t xml:space="preserve">Interpret the Result Visually</w:t>
+      </w:r>
+    </w:p>
+    <w:p>
+      <w:pPr>
+        <w:pStyle w:val="FirstParagraph"/>
+      </w:pPr>
+      <w:r>
+        <w:t xml:space="preserve">This first visual pass establishes what the method should react to in the raw series. Keep the method summary in mind here, because lSTM regression anomaly detection: Model-deviation detection using ML regression: an LSTM forecaster predicts the next value from a sliding window; large prediction errors are flagged as anomalies and the plot tells you whether that structure is clean, weak, local, repeated, or mixed with other effects.</w:t>
+      </w:r>
+    </w:p>
     <w:p>
       <w:pPr>
         <w:pStyle w:val="SourceCode"/>
       </w:pPr>
       <w:r>
         <w:rPr>
+          <w:rStyle w:val="CommentTok"/>
+        </w:rPr>
+        <w:t xml:space="preserve"># Plot the time series</w:t>
+      </w:r>
+      <w:r>
+        <w:br/>
+      </w:r>
+      <w:r>
+        <w:rPr>
+          <w:rStyle w:val="FunctionTok"/>
+        </w:rPr>
+        <w:t xml:space="preserve">har_plot</w:t>
+      </w:r>
+      <w:r>
+        <w:rPr>
+          <w:rStyle w:val="NormalTok"/>
+        </w:rPr>
+        <w:t xml:space="preserve">(</w:t>
+      </w:r>
+      <w:r>
+        <w:rPr>
+          <w:rStyle w:val="FunctionTok"/>
+        </w:rPr>
+        <w:t xml:space="preserve">harbinger</w:t>
+      </w:r>
+      <w:r>
+        <w:rPr>
+          <w:rStyle w:val="NormalTok"/>
+        </w:rPr>
+        <w:t xml:space="preserve">(), dataset</w:t>
+      </w:r>
+      <w:r>
+        <w:rPr>
+          <w:rStyle w:val="SpecialCharTok"/>
+        </w:rPr>
+        <w:t xml:space="preserve">$</w:t>
+      </w:r>
+      <w:r>
+        <w:rPr>
+          <w:rStyle w:val="NormalTok"/>
+        </w:rPr>
+        <w:t xml:space="preserve">serie)</w:t>
+      </w:r>
+    </w:p>
+    <w:bookmarkEnd w:id="12"/>
+    <w:bookmarkStart w:id="13" w:name="configure-the-method"/>
+    <w:p>
+      <w:pPr>
+        <w:pStyle w:val="Heading3"/>
+      </w:pPr>
+      <w:r>
+        <w:t xml:space="preserve">Configure the Method</w:t>
+      </w:r>
+    </w:p>
+    <w:p>
+      <w:pPr>
+        <w:pStyle w:val="FirstParagraph"/>
+      </w:pPr>
+      <w:r>
+        <w:t xml:space="preserve">The choices below turn the central modeling idea into concrete parameters. They matter because lSTM regression anomaly detection: Model-deviation detection using ML regression: an LSTM forecaster predicts the next value from a sliding window; large prediction errors are flagged as anomalies, so each argument controls how strongly the method will emphasize that pattern when it later produces anomaly flags.</w:t>
+      </w:r>
+    </w:p>
+    <w:p>
+      <w:pPr>
+        <w:pStyle w:val="SourceCode"/>
+      </w:pPr>
+      <w:r>
+        <w:rPr>
+          <w:rStyle w:val="CommentTok"/>
+        </w:rPr>
+        <w:t xml:space="preserve"># Define LSTM-based regressor (hanr_ml + ts_lstm)</w:t>
+      </w:r>
+      <w:r>
+        <w:br/>
+      </w:r>
+      <w:r>
+        <w:rPr>
+          <w:rStyle w:val="CommentTok"/>
+        </w:rPr>
+        <w:t xml:space="preserve"># - input_size: window length; epochs: training iterations</w:t>
+      </w:r>
+      <w:r>
+        <w:br/>
+      </w:r>
+      <w:r>
+        <w:rPr>
+          <w:rStyle w:val="NormalTok"/>
+        </w:rPr>
+        <w:t xml:space="preserve">model </w:t>
+      </w:r>
+      <w:r>
+        <w:rPr>
+          <w:rStyle w:val="OtherTok"/>
+        </w:rPr>
+        <w:t xml:space="preserve">&lt;-</w:t>
+      </w:r>
+      <w:r>
+        <w:rPr>
+          <w:rStyle w:val="NormalTok"/>
+        </w:rPr>
+        <w:t xml:space="preserve"> </w:t>
+      </w:r>
+      <w:r>
+        <w:rPr>
+          <w:rStyle w:val="FunctionTok"/>
+        </w:rPr>
+        <w:t xml:space="preserve">hanr_ml</w:t>
+      </w:r>
+      <w:r>
+        <w:rPr>
+          <w:rStyle w:val="NormalTok"/>
+        </w:rPr>
+        <w:t xml:space="preserve">(</w:t>
+      </w:r>
+      <w:r>
+        <w:rPr>
+          <w:rStyle w:val="FunctionTok"/>
+        </w:rPr>
+        <w:t xml:space="preserve">ts_lstm</w:t>
+      </w:r>
+      <w:r>
+        <w:rPr>
+          <w:rStyle w:val="NormalTok"/>
+        </w:rPr>
+        <w:t xml:space="preserve">(</w:t>
+      </w:r>
+      <w:r>
+        <w:rPr>
+          <w:rStyle w:val="FunctionTok"/>
+        </w:rPr>
+        <w:t xml:space="preserve">ts_norm_gminmax</w:t>
+      </w:r>
+      <w:r>
+        <w:rPr>
+          <w:rStyle w:val="NormalTok"/>
+        </w:rPr>
+        <w:t xml:space="preserve">(), </w:t>
+      </w:r>
+      <w:r>
+        <w:rPr>
+          <w:rStyle w:val="AttributeTok"/>
+        </w:rPr>
+        <w:t xml:space="preserve">input_size =</w:t>
+      </w:r>
+      <w:r>
+        <w:rPr>
+          <w:rStyle w:val="NormalTok"/>
+        </w:rPr>
+        <w:t xml:space="preserve"> </w:t>
+      </w:r>
+      <w:r>
+        <w:rPr>
+          <w:rStyle w:val="DecValTok"/>
+        </w:rPr>
+        <w:t xml:space="preserve">4</w:t>
+      </w:r>
+      <w:r>
+        <w:rPr>
+          <w:rStyle w:val="NormalTok"/>
+        </w:rPr>
+        <w:t xml:space="preserve">, </w:t>
+      </w:r>
+      <w:r>
+        <w:rPr>
+          <w:rStyle w:val="AttributeTok"/>
+        </w:rPr>
+        <w:t xml:space="preserve">epochs =</w:t>
+      </w:r>
+      <w:r>
+        <w:rPr>
+          <w:rStyle w:val="NormalTok"/>
+        </w:rPr>
+        <w:t xml:space="preserve"> </w:t>
+      </w:r>
+      <w:r>
+        <w:rPr>
+          <w:rStyle w:val="DecValTok"/>
+        </w:rPr>
+        <w:t xml:space="preserve">100</w:t>
+      </w:r>
+      <w:r>
+        <w:rPr>
+          <w:rStyle w:val="NormalTok"/>
+        </w:rPr>
+        <w:t xml:space="preserve">))</w:t>
+      </w:r>
+    </w:p>
+    <w:p>
+      <w:pPr>
+        <w:pStyle w:val="SourceCode"/>
+      </w:pPr>
+      <w:r>
+        <w:rPr>
+          <w:rStyle w:val="CommentTok"/>
+        </w:rPr>
+        <w:t xml:space="preserve"># Fit the model</w:t>
+      </w:r>
+      <w:r>
+        <w:br/>
+      </w:r>
+      <w:r>
+        <w:rPr>
+          <w:rStyle w:val="NormalTok"/>
+        </w:rPr>
+        <w:t xml:space="preserve">model </w:t>
+      </w:r>
+      <w:r>
+        <w:rPr>
+          <w:rStyle w:val="OtherTok"/>
+        </w:rPr>
+        <w:t xml:space="preserve">&lt;-</w:t>
+      </w:r>
+      <w:r>
+        <w:rPr>
+          <w:rStyle w:val="NormalTok"/>
+        </w:rPr>
+        <w:t xml:space="preserve"> </w:t>
+      </w:r>
+      <w:r>
+        <w:rPr>
+          <w:rStyle w:val="FunctionTok"/>
+        </w:rPr>
+        <w:t xml:space="preserve">fit</w:t>
+      </w:r>
+      <w:r>
+        <w:rPr>
+          <w:rStyle w:val="NormalTok"/>
+        </w:rPr>
+        <w:t xml:space="preserve">(model, dataset</w:t>
+      </w:r>
+      <w:r>
+        <w:rPr>
+          <w:rStyle w:val="SpecialCharTok"/>
+        </w:rPr>
+        <w:t xml:space="preserve">$</w:t>
+      </w:r>
+      <w:r>
+        <w:rPr>
+          <w:rStyle w:val="NormalTok"/>
+        </w:rPr>
+        <w:t xml:space="preserve">serie)</w:t>
+      </w:r>
+    </w:p>
+    <w:bookmarkEnd w:id="13"/>
+    <w:bookmarkStart w:id="14" w:name="run-the-core-analysis"/>
+    <w:p>
+      <w:pPr>
+        <w:pStyle w:val="Heading3"/>
+      </w:pPr>
+      <w:r>
+        <w:t xml:space="preserve">Run the Core Analysis</w:t>
+      </w:r>
+    </w:p>
+    <w:p>
+      <w:pPr>
+        <w:pStyle w:val="FirstParagraph"/>
+      </w:pPr>
+      <w:r>
+        <w:t xml:space="preserve">This is the moment where the notebook tests its central assumption on actual data. After applying</w:t>
+      </w:r>
+      <w:r>
+        <w:t xml:space="preserve"> </w:t>
+      </w:r>
+      <w:r>
+        <w:rPr>
           <w:rStyle w:val="VerbatimChar"/>
         </w:rPr>
-        <w:t xml:space="preserve">##       serie event</w:t>
+        <w:t xml:space="preserve">hanr_ml + ts_lstm</w:t>
+      </w:r>
+      <w:r>
+        <w:t xml:space="preserve">, the important question is whether the resulting anomaly flags really correspond to the pattern implied by the method description above, rather than to arbitrary numerical variation.</w:t>
+      </w:r>
+    </w:p>
+    <w:p>
+      <w:pPr>
+        <w:pStyle w:val="SourceCode"/>
+      </w:pPr>
+      <w:r>
+        <w:rPr>
+          <w:rStyle w:val="CommentTok"/>
+        </w:rPr>
+        <w:t xml:space="preserve"># Detect anomalies (compute residuals and events)</w:t>
       </w:r>
       <w:r>
         <w:br/>
       </w:r>
       <w:r>
         <w:rPr>
+          <w:rStyle w:val="NormalTok"/>
+        </w:rPr>
+        <w:t xml:space="preserve">detection </w:t>
+      </w:r>
+      <w:r>
+        <w:rPr>
+          <w:rStyle w:val="OtherTok"/>
+        </w:rPr>
+        <w:t xml:space="preserve">&lt;-</w:t>
+      </w:r>
+      <w:r>
+        <w:rPr>
+          <w:rStyle w:val="NormalTok"/>
+        </w:rPr>
+        <w:t xml:space="preserve"> </w:t>
+      </w:r>
+      <w:r>
+        <w:rPr>
+          <w:rStyle w:val="FunctionTok"/>
+        </w:rPr>
+        <w:t xml:space="preserve">detect</w:t>
+      </w:r>
+      <w:r>
+        <w:rPr>
+          <w:rStyle w:val="NormalTok"/>
+        </w:rPr>
+        <w:t xml:space="preserve">(model, dataset</w:t>
+      </w:r>
+      <w:r>
+        <w:rPr>
+          <w:rStyle w:val="SpecialCharTok"/>
+        </w:rPr>
+        <w:t xml:space="preserve">$</w:t>
+      </w:r>
+      <w:r>
+        <w:rPr>
+          <w:rStyle w:val="NormalTok"/>
+        </w:rPr>
+        <w:t xml:space="preserve">serie)</w:t>
+      </w:r>
+    </w:p>
+    <w:p>
+      <w:pPr>
+        <w:pStyle w:val="SourceCode"/>
+      </w:pPr>
+      <w:r>
+        <w:rPr>
+          <w:rStyle w:val="CommentTok"/>
+        </w:rPr>
+        <w:t xml:space="preserve"># Show only timestamps flagged as events</w:t>
+      </w:r>
+      <w:r>
+        <w:br/>
+      </w:r>
+      <w:r>
+        <w:rPr>
+          <w:rStyle w:val="NormalTok"/>
+        </w:rPr>
+        <w:t xml:space="preserve">  </w:t>
+      </w:r>
+      <w:r>
+        <w:rPr>
+          <w:rStyle w:val="FunctionTok"/>
+        </w:rPr>
+        <w:t xml:space="preserve">print</w:t>
+      </w:r>
+      <w:r>
+        <w:rPr>
+          <w:rStyle w:val="NormalTok"/>
+        </w:rPr>
+        <w:t xml:space="preserve">(detection </w:t>
+      </w:r>
+      <w:r>
+        <w:rPr>
+          <w:rStyle w:val="SpecialCharTok"/>
+        </w:rPr>
+        <w:t xml:space="preserve">|&gt;</w:t>
+      </w:r>
+      <w:r>
+        <w:rPr>
+          <w:rStyle w:val="NormalTok"/>
+        </w:rPr>
+        <w:t xml:space="preserve"> dplyr</w:t>
+      </w:r>
+      <w:r>
+        <w:rPr>
+          <w:rStyle w:val="SpecialCharTok"/>
+        </w:rPr>
+        <w:t xml:space="preserve">::</w:t>
+      </w:r>
+      <w:r>
+        <w:rPr>
+          <w:rStyle w:val="FunctionTok"/>
+        </w:rPr>
+        <w:t xml:space="preserve">filter</w:t>
+      </w:r>
+      <w:r>
+        <w:rPr>
+          <w:rStyle w:val="NormalTok"/>
+        </w:rPr>
+        <w:t xml:space="preserve">(event</w:t>
+      </w:r>
+      <w:r>
+        <w:rPr>
+          <w:rStyle w:val="SpecialCharTok"/>
+        </w:rPr>
+        <w:t xml:space="preserve">==</w:t>
+      </w:r>
+      <w:r>
+        <w:rPr>
+          <w:rStyle w:val="ConstantTok"/>
+        </w:rPr>
+        <w:t xml:space="preserve">TRUE</w:t>
+      </w:r>
+      <w:r>
+        <w:rPr>
+          <w:rStyle w:val="NormalTok"/>
+        </w:rPr>
+        <w:t xml:space="preserve">))</w:t>
+      </w:r>
+    </w:p>
+    <w:bookmarkEnd w:id="14"/>
+    <w:bookmarkStart w:id="15" w:name="evaluate-what-was-found"/>
+    <w:p>
+      <w:pPr>
+        <w:pStyle w:val="Heading3"/>
+      </w:pPr>
+      <w:r>
+        <w:t xml:space="preserve">Evaluate What Was Found</w:t>
+      </w:r>
+    </w:p>
+    <w:p>
+      <w:pPr>
+        <w:pStyle w:val="FirstParagraph"/>
+      </w:pPr>
+      <w:r>
+        <w:t xml:space="preserve">The evaluation asks whether the anomaly flags produced by</w:t>
+      </w:r>
+      <w:r>
+        <w:t xml:space="preserve"> </w:t>
+      </w:r>
+      <w:r>
+        <w:rPr>
           <w:rStyle w:val="VerbatimChar"/>
         </w:rPr>
-        <w:t xml:space="preserve">## 1 1.0000000 FALSE</w:t>
+        <w:t xml:space="preserve">hanr_ml + ts_lstm</w:t>
+      </w:r>
+      <w:r>
+        <w:t xml:space="preserve"> </w:t>
+      </w:r>
+      <w:r>
+        <w:t xml:space="preserve">match the labeled structure on this dataset. Read the scores as evidence about the method’s assumptions in practice, not as detached summary numbers.</w:t>
+      </w:r>
+    </w:p>
+    <w:p>
+      <w:pPr>
+        <w:pStyle w:val="SourceCode"/>
+      </w:pPr>
+      <w:r>
+        <w:rPr>
+          <w:rStyle w:val="CommentTok"/>
+        </w:rPr>
+        <w:t xml:space="preserve"># Evaluate detections against ground-truth labels</w:t>
       </w:r>
       <w:r>
         <w:br/>
       </w:r>
       <w:r>
         <w:rPr>
-          <w:rStyle w:val="VerbatimChar"/>
-        </w:rPr>
-        <w:t xml:space="preserve">## 2 0.9689124 FALSE</w:t>
+          <w:rStyle w:val="NormalTok"/>
+        </w:rPr>
+        <w:t xml:space="preserve">  evaluation </w:t>
+      </w:r>
+      <w:r>
+        <w:rPr>
+          <w:rStyle w:val="OtherTok"/>
+        </w:rPr>
+        <w:t xml:space="preserve">&lt;-</w:t>
+      </w:r>
+      <w:r>
+        <w:rPr>
+          <w:rStyle w:val="NormalTok"/>
+        </w:rPr>
+        <w:t xml:space="preserve"> </w:t>
+      </w:r>
+      <w:r>
+        <w:rPr>
+          <w:rStyle w:val="FunctionTok"/>
+        </w:rPr>
+        <w:t xml:space="preserve">evaluate</w:t>
+      </w:r>
+      <w:r>
+        <w:rPr>
+          <w:rStyle w:val="NormalTok"/>
+        </w:rPr>
+        <w:t xml:space="preserve">(model, detection</w:t>
+      </w:r>
+      <w:r>
+        <w:rPr>
+          <w:rStyle w:val="SpecialCharTok"/>
+        </w:rPr>
+        <w:t xml:space="preserve">$</w:t>
+      </w:r>
+      <w:r>
+        <w:rPr>
+          <w:rStyle w:val="NormalTok"/>
+        </w:rPr>
+        <w:t xml:space="preserve">event, dataset</w:t>
+      </w:r>
+      <w:r>
+        <w:rPr>
+          <w:rStyle w:val="SpecialCharTok"/>
+        </w:rPr>
+        <w:t xml:space="preserve">$</w:t>
+      </w:r>
+      <w:r>
+        <w:rPr>
+          <w:rStyle w:val="NormalTok"/>
+        </w:rPr>
+        <w:t xml:space="preserve">event)</w:t>
       </w:r>
       <w:r>
         <w:br/>
       </w:r>
       <w:r>
         <w:rPr>
-          <w:rStyle w:val="VerbatimChar"/>
-        </w:rPr>
-        <w:t xml:space="preserve">## 3 0.8775826 FALSE</w:t>
+          <w:rStyle w:val="NormalTok"/>
+        </w:rPr>
+        <w:t xml:space="preserve">  </w:t>
+      </w:r>
+      <w:r>
+        <w:rPr>
+          <w:rStyle w:val="FunctionTok"/>
+        </w:rPr>
+        <w:t xml:space="preserve">print</w:t>
+      </w:r>
+      <w:r>
+        <w:rPr>
+          <w:rStyle w:val="NormalTok"/>
+        </w:rPr>
+        <w:t xml:space="preserve">(evaluation</w:t>
+      </w:r>
+      <w:r>
+        <w:rPr>
+          <w:rStyle w:val="SpecialCharTok"/>
+        </w:rPr>
+        <w:t xml:space="preserve">$</w:t>
+      </w:r>
+      <w:r>
+        <w:rPr>
+          <w:rStyle w:val="NormalTok"/>
+        </w:rPr>
+        <w:t xml:space="preserve">confMatrix)</w:t>
+      </w:r>
+    </w:p>
+    <w:bookmarkEnd w:id="15"/>
+    <w:bookmarkStart w:id="16" w:name="interpret-the-result-visually-1"/>
+    <w:p>
+      <w:pPr>
+        <w:pStyle w:val="Heading3"/>
+      </w:pPr>
+      <w:r>
+        <w:t xml:space="preserve">Interpret the Result Visually</w:t>
+      </w:r>
+    </w:p>
+    <w:p>
+      <w:pPr>
+        <w:pStyle w:val="FirstParagraph"/>
+      </w:pPr>
+      <w:r>
+        <w:t xml:space="preserve">This visual check puts the model output back on top of the original signal. What matters now is whether the highlighted anomaly flags line up with the structure suggested by the method, which is the real semantic test of whether the example is teaching the right lesson.</w:t>
+      </w:r>
+    </w:p>
+    <w:p>
+      <w:pPr>
+        <w:pStyle w:val="SourceCode"/>
+      </w:pPr>
+      <w:r>
+        <w:rPr>
+          <w:rStyle w:val="CommentTok"/>
+        </w:rPr>
+        <w:t xml:space="preserve"># Plot detections over the series</w:t>
       </w:r>
       <w:r>
         <w:br/>
       </w:r>
       <w:r>
         <w:rPr>
-          <w:rStyle w:val="VerbatimChar"/>
-        </w:rPr>
-        <w:t xml:space="preserve">## 4 0.7316889 FALSE</w:t>
+          <w:rStyle w:val="NormalTok"/>
+        </w:rPr>
+        <w:t xml:space="preserve">  </w:t>
+      </w:r>
+      <w:r>
+        <w:rPr>
+          <w:rStyle w:val="FunctionTok"/>
+        </w:rPr>
+        <w:t xml:space="preserve">har_plot</w:t>
+      </w:r>
+      <w:r>
+        <w:rPr>
+          <w:rStyle w:val="NormalTok"/>
+        </w:rPr>
+        <w:t xml:space="preserve">(model, dataset</w:t>
+      </w:r>
+      <w:r>
+        <w:rPr>
+          <w:rStyle w:val="SpecialCharTok"/>
+        </w:rPr>
+        <w:t xml:space="preserve">$</w:t>
+      </w:r>
+      <w:r>
+        <w:rPr>
+          <w:rStyle w:val="NormalTok"/>
+        </w:rPr>
+        <w:t xml:space="preserve">serie, detection, dataset</w:t>
+      </w:r>
+      <w:r>
+        <w:rPr>
+          <w:rStyle w:val="SpecialCharTok"/>
+        </w:rPr>
+        <w:t xml:space="preserve">$</w:t>
+      </w:r>
+      <w:r>
+        <w:rPr>
+          <w:rStyle w:val="NormalTok"/>
+        </w:rPr>
+        <w:t xml:space="preserve">event)</w:t>
+      </w:r>
+    </w:p>
+    <w:p>
+      <w:pPr>
+        <w:pStyle w:val="SourceCode"/>
+      </w:pPr>
+      <w:r>
+        <w:rPr>
+          <w:rStyle w:val="CommentTok"/>
+        </w:rPr>
+        <w:t xml:space="preserve"># Plot residual scores and threshold</w:t>
       </w:r>
       <w:r>
         <w:br/>
       </w:r>
       <w:r>
         <w:rPr>
-          <w:rStyle w:val="VerbatimChar"/>
-        </w:rPr>
-        <w:t xml:space="preserve">## 5 0.5403023 FALSE</w:t>
-      </w:r>
-      <w:r>
-        <w:br/>
-      </w:r>
-      <w:r>
-        <w:rPr>
-          <w:rStyle w:val="VerbatimChar"/>
-        </w:rPr>
-        <w:t xml:space="preserve">## 6 0.3153224 FALSE</w:t>
-      </w:r>
-    </w:p>
-    <w:bookmarkEnd w:id="22"/>
-    <w:bookmarkStart w:id="26" w:name="interpret-the-result-visually"/>
-    <w:p>
-      <w:pPr>
-        <w:pStyle w:val="Heading3"/>
-      </w:pPr>
-      <w:r>
-        <w:t xml:space="preserve">Interpret the Result Visually</w:t>
-      </w:r>
-    </w:p>
-    <w:p>
-      <w:pPr>
-        <w:pStyle w:val="FirstParagraph"/>
-      </w:pPr>
-      <w:r>
-        <w:t xml:space="preserve">This first visual pass establishes what the method should react to in the raw series. Keep the method summary in mind here, because lSTM regression anomaly detection: Model-deviation detection using ML regression: an LSTM forecaster predicts the next value from a sliding window; large prediction errors are flagged as anomalies and the plot tells you whether that structure is clean, weak, local, repeated, or mixed with other effects.</w:t>
-      </w:r>
-    </w:p>
-    <w:p>
-      <w:pPr>
-        <w:pStyle w:val="SourceCode"/>
-      </w:pPr>
-      <w:r>
-        <w:rPr>
-          <w:rStyle w:val="CommentTok"/>
-        </w:rPr>
-        <w:t xml:space="preserve"># Plot the time series</w:t>
-      </w:r>
-      <w:r>
-        <w:br/>
+          <w:rStyle w:val="NormalTok"/>
+        </w:rPr>
+        <w:t xml:space="preserve">  </w:t>
       </w:r>
       <w:r>
         <w:rPr>
@@ -415,19 +1129,31 @@
         <w:rPr>
           <w:rStyle w:val="NormalTok"/>
         </w:rPr>
-        <w:t xml:space="preserve">(</w:t>
+        <w:t xml:space="preserve">(model, </w:t>
       </w:r>
       <w:r>
         <w:rPr>
           <w:rStyle w:val="FunctionTok"/>
         </w:rPr>
-        <w:t xml:space="preserve">harbinger</w:t>
-      </w:r>
-      <w:r>
-        <w:rPr>
-          <w:rStyle w:val="NormalTok"/>
-        </w:rPr>
-        <w:t xml:space="preserve">(), dataset</w:t>
+        <w:t xml:space="preserve">attr</w:t>
+      </w:r>
+      <w:r>
+        <w:rPr>
+          <w:rStyle w:val="NormalTok"/>
+        </w:rPr>
+        <w:t xml:space="preserve">(detection, </w:t>
+      </w:r>
+      <w:r>
+        <w:rPr>
+          <w:rStyle w:val="StringTok"/>
+        </w:rPr>
+        <w:t xml:space="preserve">"res"</w:t>
+      </w:r>
+      <w:r>
+        <w:rPr>
+          <w:rStyle w:val="NormalTok"/>
+        </w:rPr>
+        <w:t xml:space="preserve">), detection, dataset</w:t>
       </w:r>
       <w:r>
         <w:rPr>
@@ -439,107 +1165,13 @@
         <w:rPr>
           <w:rStyle w:val="NormalTok"/>
         </w:rPr>
-        <w:t xml:space="preserve">serie)</w:t>
-      </w:r>
-    </w:p>
-    <w:p>
-      <w:pPr>
-        <w:pStyle w:val="FirstParagraph"/>
-      </w:pPr>
-      <w:r>
-        <w:drawing>
-          <wp:inline>
-            <wp:extent cx="4620126" cy="3696101"/>
-            <wp:effectExtent b="0" l="0" r="0" t="0"/>
-            <wp:docPr descr="" title="" id="24" name="Picture"/>
-            <a:graphic>
-              <a:graphicData uri="http://schemas.openxmlformats.org/drawingml/2006/picture">
-                <pic:pic>
-                  <pic:nvPicPr>
-                    <pic:cNvPr descr="/home/gpca/harbinger/examples/anomalies/doc/19-regression-ml-hanr_ml_lstm_files/figure-docx/unnamed-chunk-5-1.png" id="25" name="Picture"/>
-                    <pic:cNvPicPr>
-                      <a:picLocks noChangeArrowheads="1" noChangeAspect="1"/>
-                    </pic:cNvPicPr>
-                  </pic:nvPicPr>
-                  <pic:blipFill>
-                    <a:blip r:embed="rId23"/>
-                    <a:stretch>
-                      <a:fillRect/>
-                    </a:stretch>
-                  </pic:blipFill>
-                  <pic:spPr bwMode="auto">
-                    <a:xfrm>
-                      <a:off x="0" y="0"/>
-                      <a:ext cx="4620126" cy="3696101"/>
-                    </a:xfrm>
-                    <a:prstGeom prst="rect">
-                      <a:avLst/>
-                    </a:prstGeom>
-                    <a:noFill/>
-                    <a:ln w="9525">
-                      <a:noFill/>
-                      <a:headEnd/>
-                      <a:tailEnd/>
-                    </a:ln>
-                  </pic:spPr>
-                </pic:pic>
-              </a:graphicData>
-            </a:graphic>
-          </wp:inline>
-        </w:drawing>
-      </w:r>
-    </w:p>
-    <w:bookmarkEnd w:id="26"/>
-    <w:bookmarkStart w:id="27" w:name="configure-the-method"/>
-    <w:p>
-      <w:pPr>
-        <w:pStyle w:val="Heading3"/>
-      </w:pPr>
-      <w:r>
-        <w:t xml:space="preserve">Configure the Method</w:t>
-      </w:r>
-    </w:p>
-    <w:p>
-      <w:pPr>
-        <w:pStyle w:val="FirstParagraph"/>
-      </w:pPr>
-      <w:r>
-        <w:t xml:space="preserve">The choices below turn the central modeling idea into concrete parameters. They matter because lSTM regression anomaly detection: Model-deviation detection using ML regression: an LSTM forecaster predicts the next value from a sliding window; large prediction errors are flagged as anomalies, so each argument controls how strongly the method will emphasize that pattern when it later produces anomaly flags.</w:t>
-      </w:r>
-    </w:p>
-    <w:p>
-      <w:pPr>
-        <w:pStyle w:val="SourceCode"/>
-      </w:pPr>
-      <w:r>
-        <w:rPr>
-          <w:rStyle w:val="CommentTok"/>
-        </w:rPr>
-        <w:t xml:space="preserve"># Define LSTM-based regressor (hanr_ml + ts_lstm)</w:t>
-      </w:r>
-      <w:r>
-        <w:br/>
-      </w:r>
-      <w:r>
-        <w:rPr>
-          <w:rStyle w:val="CommentTok"/>
-        </w:rPr>
-        <w:t xml:space="preserve"># - input_size: window length; epochs: training iterations</w:t>
-      </w:r>
-      <w:r>
-        <w:br/>
-      </w:r>
-      <w:r>
-        <w:rPr>
-          <w:rStyle w:val="NormalTok"/>
-        </w:rPr>
-        <w:t xml:space="preserve">  model </w:t>
-      </w:r>
-      <w:r>
-        <w:rPr>
-          <w:rStyle w:val="OtherTok"/>
-        </w:rPr>
-        <w:t xml:space="preserve">&lt;-</w:t>
+        <w:t xml:space="preserve">event, </w:t>
+      </w:r>
+      <w:r>
+        <w:rPr>
+          <w:rStyle w:val="AttributeTok"/>
+        </w:rPr>
+        <w:t xml:space="preserve">yline =</w:t>
       </w:r>
       <w:r>
         <w:rPr>
@@ -551,67 +1183,19 @@
         <w:rPr>
           <w:rStyle w:val="FunctionTok"/>
         </w:rPr>
-        <w:t xml:space="preserve">hanr_ml</w:t>
-      </w:r>
-      <w:r>
-        <w:rPr>
-          <w:rStyle w:val="NormalTok"/>
-        </w:rPr>
-        <w:t xml:space="preserve">(</w:t>
-      </w:r>
-      <w:r>
-        <w:rPr>
-          <w:rStyle w:val="FunctionTok"/>
-        </w:rPr>
-        <w:t xml:space="preserve">ts_lstm</w:t>
-      </w:r>
-      <w:r>
-        <w:rPr>
-          <w:rStyle w:val="NormalTok"/>
-        </w:rPr>
-        <w:t xml:space="preserve">(</w:t>
-      </w:r>
-      <w:r>
-        <w:rPr>
-          <w:rStyle w:val="FunctionTok"/>
-        </w:rPr>
-        <w:t xml:space="preserve">ts_norm_gminmax</w:t>
-      </w:r>
-      <w:r>
-        <w:rPr>
-          <w:rStyle w:val="NormalTok"/>
-        </w:rPr>
-        <w:t xml:space="preserve">(), </w:t>
-      </w:r>
-      <w:r>
-        <w:rPr>
-          <w:rStyle w:val="AttributeTok"/>
-        </w:rPr>
-        <w:t xml:space="preserve">input_size=</w:t>
-      </w:r>
-      <w:r>
-        <w:rPr>
-          <w:rStyle w:val="DecValTok"/>
-        </w:rPr>
-        <w:t xml:space="preserve">4</w:t>
-      </w:r>
-      <w:r>
-        <w:rPr>
-          <w:rStyle w:val="NormalTok"/>
-        </w:rPr>
-        <w:t xml:space="preserve">, </w:t>
-      </w:r>
-      <w:r>
-        <w:rPr>
-          <w:rStyle w:val="AttributeTok"/>
-        </w:rPr>
-        <w:t xml:space="preserve">epochs=</w:t>
-      </w:r>
-      <w:r>
-        <w:rPr>
-          <w:rStyle w:val="DecValTok"/>
-        </w:rPr>
-        <w:t xml:space="preserve">10000</w:t>
+        <w:t xml:space="preserve">attr</w:t>
+      </w:r>
+      <w:r>
+        <w:rPr>
+          <w:rStyle w:val="NormalTok"/>
+        </w:rPr>
+        <w:t xml:space="preserve">(detection, </w:t>
+      </w:r>
+      <w:r>
+        <w:rPr>
+          <w:rStyle w:val="StringTok"/>
+        </w:rPr>
+        <w:t xml:space="preserve">"threshold"</w:t>
       </w:r>
       <w:r>
         <w:rPr>
@@ -620,704 +1204,9 @@
         <w:t xml:space="preserve">))</w:t>
       </w:r>
     </w:p>
-    <w:p>
-      <w:pPr>
-        <w:pStyle w:val="SourceCode"/>
-      </w:pPr>
-      <w:r>
-        <w:rPr>
-          <w:rStyle w:val="CommentTok"/>
-        </w:rPr>
-        <w:t xml:space="preserve"># Fit the model</w:t>
-      </w:r>
-      <w:r>
-        <w:br/>
-      </w:r>
-      <w:r>
-        <w:rPr>
-          <w:rStyle w:val="NormalTok"/>
-        </w:rPr>
-        <w:t xml:space="preserve">  model </w:t>
-      </w:r>
-      <w:r>
-        <w:rPr>
-          <w:rStyle w:val="OtherTok"/>
-        </w:rPr>
-        <w:t xml:space="preserve">&lt;-</w:t>
-      </w:r>
-      <w:r>
-        <w:rPr>
-          <w:rStyle w:val="NormalTok"/>
-        </w:rPr>
-        <w:t xml:space="preserve"> </w:t>
-      </w:r>
-      <w:r>
-        <w:rPr>
-          <w:rStyle w:val="FunctionTok"/>
-        </w:rPr>
-        <w:t xml:space="preserve">fit</w:t>
-      </w:r>
-      <w:r>
-        <w:rPr>
-          <w:rStyle w:val="NormalTok"/>
-        </w:rPr>
-        <w:t xml:space="preserve">(model, dataset</w:t>
-      </w:r>
-      <w:r>
-        <w:rPr>
-          <w:rStyle w:val="SpecialCharTok"/>
-        </w:rPr>
-        <w:t xml:space="preserve">$</w:t>
-      </w:r>
-      <w:r>
-        <w:rPr>
-          <w:rStyle w:val="NormalTok"/>
-        </w:rPr>
-        <w:t xml:space="preserve">serie)</w:t>
-      </w:r>
-    </w:p>
-    <w:bookmarkEnd w:id="27"/>
-    <w:bookmarkStart w:id="28" w:name="run-the-core-analysis"/>
-    <w:p>
-      <w:pPr>
-        <w:pStyle w:val="Heading3"/>
-      </w:pPr>
-      <w:r>
-        <w:t xml:space="preserve">Run the Core Analysis</w:t>
-      </w:r>
-    </w:p>
-    <w:p>
-      <w:pPr>
-        <w:pStyle w:val="FirstParagraph"/>
-      </w:pPr>
-      <w:r>
-        <w:t xml:space="preserve">This is the moment where the notebook tests its central assumption on actual data. After applying</w:t>
-      </w:r>
-      <w:r>
-        <w:t xml:space="preserve"> </w:t>
-      </w:r>
-      <w:r>
-        <w:rPr>
-          <w:rStyle w:val="VerbatimChar"/>
-        </w:rPr>
-        <w:t xml:space="preserve">hanr_ml + ts_lstm</w:t>
-      </w:r>
-      <w:r>
-        <w:t xml:space="preserve">, the important question is whether the resulting anomaly flags really correspond to the pattern implied by the method description above, rather than to arbitrary numerical variation.</w:t>
-      </w:r>
-    </w:p>
-    <w:p>
-      <w:pPr>
-        <w:pStyle w:val="SourceCode"/>
-      </w:pPr>
-      <w:r>
-        <w:rPr>
-          <w:rStyle w:val="CommentTok"/>
-        </w:rPr>
-        <w:t xml:space="preserve"># Detect anomalies (compute residuals and events)</w:t>
-      </w:r>
-      <w:r>
-        <w:br/>
-      </w:r>
-      <w:r>
-        <w:rPr>
-          <w:rStyle w:val="NormalTok"/>
-        </w:rPr>
-        <w:t xml:space="preserve">  detection </w:t>
-      </w:r>
-      <w:r>
-        <w:rPr>
-          <w:rStyle w:val="OtherTok"/>
-        </w:rPr>
-        <w:t xml:space="preserve">&lt;-</w:t>
-      </w:r>
-      <w:r>
-        <w:rPr>
-          <w:rStyle w:val="NormalTok"/>
-        </w:rPr>
-        <w:t xml:space="preserve"> </w:t>
-      </w:r>
-      <w:r>
-        <w:rPr>
-          <w:rStyle w:val="FunctionTok"/>
-        </w:rPr>
-        <w:t xml:space="preserve">detect</w:t>
-      </w:r>
-      <w:r>
-        <w:rPr>
-          <w:rStyle w:val="NormalTok"/>
-        </w:rPr>
-        <w:t xml:space="preserve">(model, dataset</w:t>
-      </w:r>
-      <w:r>
-        <w:rPr>
-          <w:rStyle w:val="SpecialCharTok"/>
-        </w:rPr>
-        <w:t xml:space="preserve">$</w:t>
-      </w:r>
-      <w:r>
-        <w:rPr>
-          <w:rStyle w:val="NormalTok"/>
-        </w:rPr>
-        <w:t xml:space="preserve">serie)</w:t>
-      </w:r>
-    </w:p>
-    <w:p>
-      <w:pPr>
-        <w:pStyle w:val="SourceCode"/>
-      </w:pPr>
-      <w:r>
-        <w:rPr>
-          <w:rStyle w:val="CommentTok"/>
-        </w:rPr>
-        <w:t xml:space="preserve"># Show only timestamps flagged as events</w:t>
-      </w:r>
-      <w:r>
-        <w:br/>
-      </w:r>
-      <w:r>
-        <w:rPr>
-          <w:rStyle w:val="NormalTok"/>
-        </w:rPr>
-        <w:t xml:space="preserve">  </w:t>
-      </w:r>
-      <w:r>
-        <w:rPr>
-          <w:rStyle w:val="FunctionTok"/>
-        </w:rPr>
-        <w:t xml:space="preserve">print</w:t>
-      </w:r>
-      <w:r>
-        <w:rPr>
-          <w:rStyle w:val="NormalTok"/>
-        </w:rPr>
-        <w:t xml:space="preserve">(detection </w:t>
-      </w:r>
-      <w:r>
-        <w:rPr>
-          <w:rStyle w:val="SpecialCharTok"/>
-        </w:rPr>
-        <w:t xml:space="preserve">|&gt;</w:t>
-      </w:r>
-      <w:r>
-        <w:rPr>
-          <w:rStyle w:val="NormalTok"/>
-        </w:rPr>
-        <w:t xml:space="preserve"> dplyr</w:t>
-      </w:r>
-      <w:r>
-        <w:rPr>
-          <w:rStyle w:val="SpecialCharTok"/>
-        </w:rPr>
-        <w:t xml:space="preserve">::</w:t>
-      </w:r>
-      <w:r>
-        <w:rPr>
-          <w:rStyle w:val="FunctionTok"/>
-        </w:rPr>
-        <w:t xml:space="preserve">filter</w:t>
-      </w:r>
-      <w:r>
-        <w:rPr>
-          <w:rStyle w:val="NormalTok"/>
-        </w:rPr>
-        <w:t xml:space="preserve">(event</w:t>
-      </w:r>
-      <w:r>
-        <w:rPr>
-          <w:rStyle w:val="SpecialCharTok"/>
-        </w:rPr>
-        <w:t xml:space="preserve">==</w:t>
-      </w:r>
-      <w:r>
-        <w:rPr>
-          <w:rStyle w:val="ConstantTok"/>
-        </w:rPr>
-        <w:t xml:space="preserve">TRUE</w:t>
-      </w:r>
-      <w:r>
-        <w:rPr>
-          <w:rStyle w:val="NormalTok"/>
-        </w:rPr>
-        <w:t xml:space="preserve">))</w:t>
-      </w:r>
-    </w:p>
-    <w:p>
-      <w:pPr>
-        <w:pStyle w:val="SourceCode"/>
-      </w:pPr>
-      <w:r>
-        <w:rPr>
-          <w:rStyle w:val="VerbatimChar"/>
-        </w:rPr>
-        <w:t xml:space="preserve">##   idx event    type</w:t>
-      </w:r>
-      <w:r>
-        <w:br/>
-      </w:r>
-      <w:r>
-        <w:rPr>
-          <w:rStyle w:val="VerbatimChar"/>
-        </w:rPr>
-        <w:t xml:space="preserve">## 1  50  TRUE anomaly</w:t>
-      </w:r>
-      <w:r>
-        <w:br/>
-      </w:r>
-      <w:r>
-        <w:rPr>
-          <w:rStyle w:val="VerbatimChar"/>
-        </w:rPr>
-        <w:t xml:space="preserve">## 2  54  TRUE anomaly</w:t>
-      </w:r>
-    </w:p>
-    <w:bookmarkEnd w:id="28"/>
-    <w:bookmarkStart w:id="29" w:name="evaluate-what-was-found"/>
-    <w:p>
-      <w:pPr>
-        <w:pStyle w:val="Heading3"/>
-      </w:pPr>
-      <w:r>
-        <w:t xml:space="preserve">Evaluate What Was Found</w:t>
-      </w:r>
-    </w:p>
-    <w:p>
-      <w:pPr>
-        <w:pStyle w:val="FirstParagraph"/>
-      </w:pPr>
-      <w:r>
-        <w:t xml:space="preserve">The evaluation asks whether the anomaly flags produced by</w:t>
-      </w:r>
-      <w:r>
-        <w:t xml:space="preserve"> </w:t>
-      </w:r>
-      <w:r>
-        <w:rPr>
-          <w:rStyle w:val="VerbatimChar"/>
-        </w:rPr>
-        <w:t xml:space="preserve">hanr_ml + ts_lstm</w:t>
-      </w:r>
-      <w:r>
-        <w:t xml:space="preserve"> </w:t>
-      </w:r>
-      <w:r>
-        <w:t xml:space="preserve">match the labeled structure on this dataset. Read the scores as evidence about the method’s assumptions in practice, not as detached summary numbers.</w:t>
-      </w:r>
-    </w:p>
-    <w:p>
-      <w:pPr>
-        <w:pStyle w:val="SourceCode"/>
-      </w:pPr>
-      <w:r>
-        <w:rPr>
-          <w:rStyle w:val="CommentTok"/>
-        </w:rPr>
-        <w:t xml:space="preserve"># Evaluate detections against ground-truth labels</w:t>
-      </w:r>
-      <w:r>
-        <w:br/>
-      </w:r>
-      <w:r>
-        <w:rPr>
-          <w:rStyle w:val="NormalTok"/>
-        </w:rPr>
-        <w:t xml:space="preserve">  evaluation </w:t>
-      </w:r>
-      <w:r>
-        <w:rPr>
-          <w:rStyle w:val="OtherTok"/>
-        </w:rPr>
-        <w:t xml:space="preserve">&lt;-</w:t>
-      </w:r>
-      <w:r>
-        <w:rPr>
-          <w:rStyle w:val="NormalTok"/>
-        </w:rPr>
-        <w:t xml:space="preserve"> </w:t>
-      </w:r>
-      <w:r>
-        <w:rPr>
-          <w:rStyle w:val="FunctionTok"/>
-        </w:rPr>
-        <w:t xml:space="preserve">evaluate</w:t>
-      </w:r>
-      <w:r>
-        <w:rPr>
-          <w:rStyle w:val="NormalTok"/>
-        </w:rPr>
-        <w:t xml:space="preserve">(model, detection</w:t>
-      </w:r>
-      <w:r>
-        <w:rPr>
-          <w:rStyle w:val="SpecialCharTok"/>
-        </w:rPr>
-        <w:t xml:space="preserve">$</w:t>
-      </w:r>
-      <w:r>
-        <w:rPr>
-          <w:rStyle w:val="NormalTok"/>
-        </w:rPr>
-        <w:t xml:space="preserve">event, dataset</w:t>
-      </w:r>
-      <w:r>
-        <w:rPr>
-          <w:rStyle w:val="SpecialCharTok"/>
-        </w:rPr>
-        <w:t xml:space="preserve">$</w:t>
-      </w:r>
-      <w:r>
-        <w:rPr>
-          <w:rStyle w:val="NormalTok"/>
-        </w:rPr>
-        <w:t xml:space="preserve">event)</w:t>
-      </w:r>
-      <w:r>
-        <w:br/>
-      </w:r>
-      <w:r>
-        <w:rPr>
-          <w:rStyle w:val="NormalTok"/>
-        </w:rPr>
-        <w:t xml:space="preserve">  </w:t>
-      </w:r>
-      <w:r>
-        <w:rPr>
-          <w:rStyle w:val="FunctionTok"/>
-        </w:rPr>
-        <w:t xml:space="preserve">print</w:t>
-      </w:r>
-      <w:r>
-        <w:rPr>
-          <w:rStyle w:val="NormalTok"/>
-        </w:rPr>
-        <w:t xml:space="preserve">(evaluation</w:t>
-      </w:r>
-      <w:r>
-        <w:rPr>
-          <w:rStyle w:val="SpecialCharTok"/>
-        </w:rPr>
-        <w:t xml:space="preserve">$</w:t>
-      </w:r>
-      <w:r>
-        <w:rPr>
-          <w:rStyle w:val="NormalTok"/>
-        </w:rPr>
-        <w:t xml:space="preserve">confMatrix)</w:t>
-      </w:r>
-    </w:p>
-    <w:p>
-      <w:pPr>
-        <w:pStyle w:val="SourceCode"/>
-      </w:pPr>
-      <w:r>
-        <w:rPr>
-          <w:rStyle w:val="VerbatimChar"/>
-        </w:rPr>
-        <w:t xml:space="preserve">##           event      </w:t>
-      </w:r>
-      <w:r>
-        <w:br/>
-      </w:r>
-      <w:r>
-        <w:rPr>
-          <w:rStyle w:val="VerbatimChar"/>
-        </w:rPr>
-        <w:t xml:space="preserve">## detection TRUE  FALSE</w:t>
-      </w:r>
-      <w:r>
-        <w:br/>
-      </w:r>
-      <w:r>
-        <w:rPr>
-          <w:rStyle w:val="VerbatimChar"/>
-        </w:rPr>
-        <w:t xml:space="preserve">## TRUE      1     1    </w:t>
-      </w:r>
-      <w:r>
-        <w:br/>
-      </w:r>
-      <w:r>
-        <w:rPr>
-          <w:rStyle w:val="VerbatimChar"/>
-        </w:rPr>
-        <w:t xml:space="preserve">## FALSE     0     99</w:t>
-      </w:r>
-    </w:p>
-    <w:bookmarkEnd w:id="29"/>
-    <w:bookmarkStart w:id="36" w:name="interpret-the-result-visually-1"/>
-    <w:p>
-      <w:pPr>
-        <w:pStyle w:val="Heading3"/>
-      </w:pPr>
-      <w:r>
-        <w:t xml:space="preserve">Interpret the Result Visually</w:t>
-      </w:r>
-    </w:p>
-    <w:p>
-      <w:pPr>
-        <w:pStyle w:val="FirstParagraph"/>
-      </w:pPr>
-      <w:r>
-        <w:t xml:space="preserve">This visual check puts the model output back on top of the original signal. What matters now is whether the highlighted anomaly flags line up with the structure suggested by the method, which is the real semantic test of whether the example is teaching the right lesson.</w:t>
-      </w:r>
-    </w:p>
-    <w:p>
-      <w:pPr>
-        <w:pStyle w:val="SourceCode"/>
-      </w:pPr>
-      <w:r>
-        <w:rPr>
-          <w:rStyle w:val="CommentTok"/>
-        </w:rPr>
-        <w:t xml:space="preserve"># Plot detections over the series</w:t>
-      </w:r>
-      <w:r>
-        <w:br/>
-      </w:r>
-      <w:r>
-        <w:rPr>
-          <w:rStyle w:val="NormalTok"/>
-        </w:rPr>
-        <w:t xml:space="preserve">  </w:t>
-      </w:r>
-      <w:r>
-        <w:rPr>
-          <w:rStyle w:val="FunctionTok"/>
-        </w:rPr>
-        <w:t xml:space="preserve">har_plot</w:t>
-      </w:r>
-      <w:r>
-        <w:rPr>
-          <w:rStyle w:val="NormalTok"/>
-        </w:rPr>
-        <w:t xml:space="preserve">(model, dataset</w:t>
-      </w:r>
-      <w:r>
-        <w:rPr>
-          <w:rStyle w:val="SpecialCharTok"/>
-        </w:rPr>
-        <w:t xml:space="preserve">$</w:t>
-      </w:r>
-      <w:r>
-        <w:rPr>
-          <w:rStyle w:val="NormalTok"/>
-        </w:rPr>
-        <w:t xml:space="preserve">serie, detection, dataset</w:t>
-      </w:r>
-      <w:r>
-        <w:rPr>
-          <w:rStyle w:val="SpecialCharTok"/>
-        </w:rPr>
-        <w:t xml:space="preserve">$</w:t>
-      </w:r>
-      <w:r>
-        <w:rPr>
-          <w:rStyle w:val="NormalTok"/>
-        </w:rPr>
-        <w:t xml:space="preserve">event)</w:t>
-      </w:r>
-    </w:p>
-    <w:p>
-      <w:pPr>
-        <w:pStyle w:val="FirstParagraph"/>
-      </w:pPr>
-      <w:r>
-        <w:drawing>
-          <wp:inline>
-            <wp:extent cx="4620126" cy="3696101"/>
-            <wp:effectExtent b="0" l="0" r="0" t="0"/>
-            <wp:docPr descr="" title="" id="31" name="Picture"/>
-            <a:graphic>
-              <a:graphicData uri="http://schemas.openxmlformats.org/drawingml/2006/picture">
-                <pic:pic>
-                  <pic:nvPicPr>
-                    <pic:cNvPr descr="/home/gpca/harbinger/examples/anomalies/doc/19-regression-ml-hanr_ml_lstm_files/figure-docx/unnamed-chunk-11-1.png" id="32" name="Picture"/>
-                    <pic:cNvPicPr>
-                      <a:picLocks noChangeArrowheads="1" noChangeAspect="1"/>
-                    </pic:cNvPicPr>
-                  </pic:nvPicPr>
-                  <pic:blipFill>
-                    <a:blip r:embed="rId30"/>
-                    <a:stretch>
-                      <a:fillRect/>
-                    </a:stretch>
-                  </pic:blipFill>
-                  <pic:spPr bwMode="auto">
-                    <a:xfrm>
-                      <a:off x="0" y="0"/>
-                      <a:ext cx="4620126" cy="3696101"/>
-                    </a:xfrm>
-                    <a:prstGeom prst="rect">
-                      <a:avLst/>
-                    </a:prstGeom>
-                    <a:noFill/>
-                    <a:ln w="9525">
-                      <a:noFill/>
-                      <a:headEnd/>
-                      <a:tailEnd/>
-                    </a:ln>
-                  </pic:spPr>
-                </pic:pic>
-              </a:graphicData>
-            </a:graphic>
-          </wp:inline>
-        </w:drawing>
-      </w:r>
-    </w:p>
-    <w:p>
-      <w:pPr>
-        <w:pStyle w:val="SourceCode"/>
-      </w:pPr>
-      <w:r>
-        <w:rPr>
-          <w:rStyle w:val="CommentTok"/>
-        </w:rPr>
-        <w:t xml:space="preserve"># Plot residual scores and threshold</w:t>
-      </w:r>
-      <w:r>
-        <w:br/>
-      </w:r>
-      <w:r>
-        <w:rPr>
-          <w:rStyle w:val="NormalTok"/>
-        </w:rPr>
-        <w:t xml:space="preserve">  </w:t>
-      </w:r>
-      <w:r>
-        <w:rPr>
-          <w:rStyle w:val="FunctionTok"/>
-        </w:rPr>
-        <w:t xml:space="preserve">har_plot</w:t>
-      </w:r>
-      <w:r>
-        <w:rPr>
-          <w:rStyle w:val="NormalTok"/>
-        </w:rPr>
-        <w:t xml:space="preserve">(model, </w:t>
-      </w:r>
-      <w:r>
-        <w:rPr>
-          <w:rStyle w:val="FunctionTok"/>
-        </w:rPr>
-        <w:t xml:space="preserve">attr</w:t>
-      </w:r>
-      <w:r>
-        <w:rPr>
-          <w:rStyle w:val="NormalTok"/>
-        </w:rPr>
-        <w:t xml:space="preserve">(detection, </w:t>
-      </w:r>
-      <w:r>
-        <w:rPr>
-          <w:rStyle w:val="StringTok"/>
-        </w:rPr>
-        <w:t xml:space="preserve">"res"</w:t>
-      </w:r>
-      <w:r>
-        <w:rPr>
-          <w:rStyle w:val="NormalTok"/>
-        </w:rPr>
-        <w:t xml:space="preserve">), detection, dataset</w:t>
-      </w:r>
-      <w:r>
-        <w:rPr>
-          <w:rStyle w:val="SpecialCharTok"/>
-        </w:rPr>
-        <w:t xml:space="preserve">$</w:t>
-      </w:r>
-      <w:r>
-        <w:rPr>
-          <w:rStyle w:val="NormalTok"/>
-        </w:rPr>
-        <w:t xml:space="preserve">event, </w:t>
-      </w:r>
-      <w:r>
-        <w:rPr>
-          <w:rStyle w:val="AttributeTok"/>
-        </w:rPr>
-        <w:t xml:space="preserve">yline =</w:t>
-      </w:r>
-      <w:r>
-        <w:rPr>
-          <w:rStyle w:val="NormalTok"/>
-        </w:rPr>
-        <w:t xml:space="preserve"> </w:t>
-      </w:r>
-      <w:r>
-        <w:rPr>
-          <w:rStyle w:val="FunctionTok"/>
-        </w:rPr>
-        <w:t xml:space="preserve">attr</w:t>
-      </w:r>
-      <w:r>
-        <w:rPr>
-          <w:rStyle w:val="NormalTok"/>
-        </w:rPr>
-        <w:t xml:space="preserve">(detection, </w:t>
-      </w:r>
-      <w:r>
-        <w:rPr>
-          <w:rStyle w:val="StringTok"/>
-        </w:rPr>
-        <w:t xml:space="preserve">"threshold"</w:t>
-      </w:r>
-      <w:r>
-        <w:rPr>
-          <w:rStyle w:val="NormalTok"/>
-        </w:rPr>
-        <w:t xml:space="preserve">))</w:t>
-      </w:r>
-    </w:p>
-    <w:p>
-      <w:pPr>
-        <w:pStyle w:val="FirstParagraph"/>
-      </w:pPr>
-      <w:r>
-        <w:drawing>
-          <wp:inline>
-            <wp:extent cx="4620126" cy="3696101"/>
-            <wp:effectExtent b="0" l="0" r="0" t="0"/>
-            <wp:docPr descr="" title="" id="34" name="Picture"/>
-            <a:graphic>
-              <a:graphicData uri="http://schemas.openxmlformats.org/drawingml/2006/picture">
-                <pic:pic>
-                  <pic:nvPicPr>
-                    <pic:cNvPr descr="/home/gpca/harbinger/examples/anomalies/doc/19-regression-ml-hanr_ml_lstm_files/figure-docx/unnamed-chunk-12-1.png" id="35" name="Picture"/>
-                    <pic:cNvPicPr>
-                      <a:picLocks noChangeArrowheads="1" noChangeAspect="1"/>
-                    </pic:cNvPicPr>
-                  </pic:nvPicPr>
-                  <pic:blipFill>
-                    <a:blip r:embed="rId33"/>
-                    <a:stretch>
-                      <a:fillRect/>
-                    </a:stretch>
-                  </pic:blipFill>
-                  <pic:spPr bwMode="auto">
-                    <a:xfrm>
-                      <a:off x="0" y="0"/>
-                      <a:ext cx="4620126" cy="3696101"/>
-                    </a:xfrm>
-                    <a:prstGeom prst="rect">
-                      <a:avLst/>
-                    </a:prstGeom>
-                    <a:noFill/>
-                    <a:ln w="9525">
-                      <a:noFill/>
-                      <a:headEnd/>
-                      <a:tailEnd/>
-                    </a:ln>
-                  </pic:spPr>
-                </pic:pic>
-              </a:graphicData>
-            </a:graphic>
-          </wp:inline>
-        </w:drawing>
-      </w:r>
-    </w:p>
-    <w:bookmarkEnd w:id="36"/>
-    <w:bookmarkEnd w:id="37"/>
-    <w:bookmarkStart w:id="38" w:name="references"/>
+    <w:bookmarkEnd w:id="16"/>
+    <w:bookmarkEnd w:id="17"/>
+    <w:bookmarkStart w:id="18" w:name="references"/>
     <w:p>
       <w:pPr>
         <w:pStyle w:val="Heading2"/>
@@ -1350,7 +1239,7 @@
         <w:t xml:space="preserve">Hyndman, R. J., Athanasopoulos, G. (2021). Forecasting: Principles and Practice. OTexts.</w:t>
       </w:r>
     </w:p>
-    <w:bookmarkEnd w:id="38"/>
+    <w:bookmarkEnd w:id="18"/>
     <w:sectPr>
       <w:footnotePr>
         <w:numRestart w:val="eachSect"/>
@@ -1581,10 +1470,10 @@
   <w:docDefaults>
     <w:rPrDefault>
       <w:rPr>
-        <w:rFonts w:asciiTheme="minorHAnsi" w:cstheme="minorBidi" w:eastAsiaTheme="minorHAnsi" w:hAnsiTheme="minorHAnsi"/>
+        <w:rFonts w:asciiTheme="minorHAnsi" w:cstheme="minorBidi" w:eastAsiaTheme="minorEastAsia" w:hAnsiTheme="minorHAnsi"/>
         <w:sz w:val="24"/>
         <w:szCs w:val="24"/>
-        <w:lang w:bidi="ar-SA" w:eastAsia="en-US" w:val="en-US"/>
+        <w:lang w:bidi="ar-SA" w:eastAsia="zh-CN" w:val="en-US"/>
       </w:rPr>
     </w:rPrDefault>
     <w:pPrDefault>
@@ -2125,13 +2014,6 @@
       </w:tblCellMar>
     </w:tblPr>
     <w:tblStylePr w:type="firstRow">
-      <w:tblPr>
-        <w:jc w:val="left"/>
-        <w:tblInd w:type="dxa" w:w="0"/>
-      </w:tblPr>
-      <w:trPr>
-        <w:jc w:val="left"/>
-      </w:trPr>
       <w:tcPr>
         <w:tcBorders>
           <w:bottom w:val="single"/>

</xml_diff>